<commit_message>
chore: remove unused document and regex test files
</commit_message>
<xml_diff>
--- a/assets/Surat/Surat Pernyataan Pinjam Uang.docx
+++ b/assets/Surat/Surat Pernyataan Pinjam Uang.docx
@@ -20,7 +20,7 @@
         <w:rPr>
           <w:rFonts w:ascii="Bookman Old Style" w:hAnsi="Bookman Old Style"/>
         </w:rPr>
-        <w:t>13-01-2022</w:t>
+        <w:t xml:space="preserve"> …..</w:t>
       </w:r>
     </w:p>
     <w:p>
@@ -557,7 +557,31 @@
         <w:rPr>
           <w:rFonts w:ascii="Bookman Old Style" w:hAnsi="Bookman Old Style"/>
         </w:rPr>
-        <w:t>Di dalam pernyataan ini, pihak I meminjam uang kepada pihak ke II  sebesar Rp72.000.000 (Tujuh puluh dua juta rupiah).  Selama pihak ke I belum bisa mengembalikan uang tersebut, pihak ke I memberi jaminan mobil Avanza Th. 2012 No. Plat</w:t>
+        <w:t xml:space="preserve">Di dalam pernyataan ini, pihak I meminjam uang kepada pihak ke II  sebesar </w:t>
+      </w:r>
+      <w:r>
+        <w:rPr>
+          <w:rFonts w:ascii="Bookman Old Style" w:hAnsi="Bookman Old Style"/>
+        </w:rPr>
+        <w:t xml:space="preserve">…… </w:t>
+      </w:r>
+      <w:r>
+        <w:rPr>
+          <w:rFonts w:ascii="Bookman Old Style" w:hAnsi="Bookman Old Style"/>
+        </w:rPr>
+        <w:t xml:space="preserve">.  Selama pihak ke I belum bisa mengembalikan uang tersebut, pihak ke I </w:t>
+      </w:r>
+      <w:r>
+        <w:rPr>
+          <w:rFonts w:ascii="Bookman Old Style" w:hAnsi="Bookman Old Style"/>
+        </w:rPr>
+        <w:t>memberikan jaminan berupa</w:t>
+      </w:r>
+      <w:r>
+        <w:rPr>
+          <w:rFonts w:ascii="Bookman Old Style" w:hAnsi="Bookman Old Style"/>
+        </w:rPr>
+        <w:t xml:space="preserve"> mobil Avanza Th. 2012 No. Plat</w:t>
       </w:r>
       <w:r>
         <w:rPr>
@@ -1076,6 +1100,7 @@
         <w:jc w:val="right"/>
       </w:pPr>
       <w:r>
+        <w:lastRenderedPageBreak/>
         <w:t>1</w:t>
       </w:r>
     </w:p>
@@ -1696,6 +1721,7 @@
         <w:jc w:val="right"/>
       </w:pPr>
       <w:r>
+        <w:lastRenderedPageBreak/>
         <w:t>Sumber Malang , 16 November 2021</w:t>
       </w:r>
     </w:p>

</xml_diff>